<commit_message>
collection codes to reflect default collection codes
</commit_message>
<xml_diff>
--- a/Documentation.docx
+++ b/Documentation.docx
@@ -2039,6 +2039,213 @@
           <w:sz w:val="22"/>
         </w:rPr>
         <w:t>- Collection codes are now visible and editable in Collections page according to role rights.</w:t>
+      </w:r>
+    </w:p>
+    <w:p/>
+    <w:p>
+      <w:r>
+        <w:rPr>
+          <w:b/>
+          <w:sz w:val="24"/>
+        </w:rPr>
+        <w:t>FINAL IMPLEMENTATION UPDATE - APRIL 2026</w:t>
+      </w:r>
+    </w:p>
+    <w:p>
+      <w:r>
+        <w:rPr>
+          <w:sz w:val="22"/>
+        </w:rPr>
+        <w:t>1) Church Codes vs Collection Codes</w:t>
+      </w:r>
+    </w:p>
+    <w:p>
+      <w:r>
+        <w:rPr>
+          <w:sz w:val="22"/>
+        </w:rPr>
+        <w:t>- Church codes (church context/id) identify which church owns data.</w:t>
+      </w:r>
+    </w:p>
+    <w:p>
+      <w:r>
+        <w:rPr>
+          <w:sz w:val="22"/>
+        </w:rPr>
+        <w:t>- Collection codes define offering fields/labels used during collections entry.</w:t>
+      </w:r>
+    </w:p>
+    <w:p>
+      <w:r>
+        <w:rPr>
+          <w:sz w:val="22"/>
+        </w:rPr>
+        <w:t>- These are separate concepts and are handled separately in both UI and DB.</w:t>
+      </w:r>
+    </w:p>
+    <w:p/>
+    <w:p>
+      <w:r>
+        <w:rPr>
+          <w:sz w:val="22"/>
+        </w:rPr>
+        <w:t>2) Collection Codes UI Placement</w:t>
+      </w:r>
+    </w:p>
+    <w:p>
+      <w:r>
+        <w:rPr>
+          <w:sz w:val="22"/>
+        </w:rPr>
+        <w:t>- Collection Codes is under the Collections menu.</w:t>
+      </w:r>
+    </w:p>
+    <w:p>
+      <w:r>
+        <w:rPr>
+          <w:sz w:val="22"/>
+        </w:rPr>
+        <w:t>- Collection Codes was removed from Settings.</w:t>
+      </w:r>
+    </w:p>
+    <w:p>
+      <w:r>
+        <w:rPr>
+          <w:sz w:val="22"/>
+        </w:rPr>
+        <w:t>- Treasury and all roles that can access Collections can see the collection-codes section.</w:t>
+      </w:r>
+    </w:p>
+    <w:p/>
+    <w:p>
+      <w:r>
+        <w:rPr>
+          <w:sz w:val="22"/>
+        </w:rPr>
+        <w:t>3) View and Edit Behavior</w:t>
+      </w:r>
+    </w:p>
+    <w:p>
+      <w:r>
+        <w:rPr>
+          <w:sz w:val="22"/>
+        </w:rPr>
+        <w:t>- can_manage_collections: can add, edit, delete collection codes.</w:t>
+      </w:r>
+    </w:p>
+    <w:p>
+      <w:r>
+        <w:rPr>
+          <w:sz w:val="22"/>
+        </w:rPr>
+        <w:t>- can_view_collection_codes: can view collection codes in read-only mode.</w:t>
+      </w:r>
+    </w:p>
+    <w:p>
+      <w:r>
+        <w:rPr>
+          <w:sz w:val="22"/>
+        </w:rPr>
+        <w:t>- Collection codes panel now opens by default for easier visibility.</w:t>
+      </w:r>
+    </w:p>
+    <w:p>
+      <w:r>
+        <w:rPr>
+          <w:sz w:val="22"/>
+        </w:rPr>
+        <w:t>- View/Hide link is available and row-size selector supports 10, 30, 50, 100, 200.</w:t>
+      </w:r>
+    </w:p>
+    <w:p/>
+    <w:p>
+      <w:r>
+        <w:rPr>
+          <w:sz w:val="22"/>
+        </w:rPr>
+        <w:t>4) Default Codes from Workbook</w:t>
+      </w:r>
+    </w:p>
+    <w:p>
+      <w:r>
+        <w:rPr>
+          <w:sz w:val="22"/>
+        </w:rPr>
+        <w:t>- Source workbook: Collection_Codes.xlsx.</w:t>
+      </w:r>
+    </w:p>
+    <w:p>
+      <w:r>
+        <w:rPr>
+          <w:sz w:val="22"/>
+        </w:rPr>
+        <w:t>- Defaults are materialized per church (church-scoped rows), not only global rows.</w:t>
+      </w:r>
+    </w:p>
+    <w:p>
+      <w:r>
+        <w:rPr>
+          <w:sz w:val="22"/>
+        </w:rPr>
+        <w:t>- Import executes on startup and when a new church is created.</w:t>
+      </w:r>
+    </w:p>
+    <w:p/>
+    <w:p>
+      <w:r>
+        <w:rPr>
+          <w:sz w:val="22"/>
+        </w:rPr>
+        <w:t>5) Database Migration/Compatibility</w:t>
+      </w:r>
+    </w:p>
+    <w:p>
+      <w:r>
+        <w:rPr>
+          <w:sz w:val="22"/>
+        </w:rPr>
+        <w:t>- Legacy PostgreSQL unique constraint on collection_codes.column_name was removed.</w:t>
+      </w:r>
+    </w:p>
+    <w:p>
+      <w:r>
+        <w:rPr>
+          <w:sz w:val="22"/>
+        </w:rPr>
+        <w:t>- This allows same collection field names to exist across different churches.</w:t>
+      </w:r>
+    </w:p>
+    <w:p>
+      <w:r>
+        <w:rPr>
+          <w:sz w:val="22"/>
+        </w:rPr>
+        <w:t>- Existing installations can now import per-church defaults successfully.</w:t>
+      </w:r>
+    </w:p>
+    <w:p/>
+    <w:p>
+      <w:r>
+        <w:rPr>
+          <w:sz w:val="22"/>
+        </w:rPr>
+        <w:t>6) Operational Outcome</w:t>
+      </w:r>
+    </w:p>
+    <w:p>
+      <w:r>
+        <w:rPr>
+          <w:sz w:val="22"/>
+        </w:rPr>
+        <w:t>- Default workbook codes are now present in database and visible in Collections.</w:t>
+      </w:r>
+    </w:p>
+    <w:p>
+      <w:r>
+        <w:rPr>
+          <w:sz w:val="22"/>
+        </w:rPr>
+        <w:t>- Roles with manage rights can edit defaults directly from Collection Codes section.</w:t>
       </w:r>
     </w:p>
     <w:sectPr>

</xml_diff>